<commit_message>
Informe 1.3: suma el bloque bureau_balance como experimento medido y por que no entro al modelo final
</commit_message>
<xml_diff>
--- a/TP_Machine_Learning_informe_1.docx
+++ b/TP_Machine_Learning_informe_1.docx
@@ -2290,6 +2290,50 @@
           <w:szCs w:val="16"/>
         </w:rPr>
         <w:t xml:space="preserve">Figura 1. AUC por etapa (validación cruzada) y score de Kaggle Private de las dos submissions.</w:t>
+      </w:r>
+    </w:p>
+    <w:p>
+      <w:pPr>
+        <w:spacing w:after="140" w:line="300"/>
+        <w:jc w:val="both"/>
+      </w:pPr>
+      <w:r>
+        <w:rPr>
+          <w:b/>
+          <w:bCs/>
+          <w:sz w:val="20"/>
+          <w:szCs w:val="20"/>
+        </w:rPr>
+        <w:t xml:space="preserve">Un bloque adicional, medido y descartado. </w:t>
+      </w:r>
+      <w:r>
+        <w:rPr>
+          <w:sz w:val="20"/>
+          <w:szCs w:val="20"/>
+        </w:rPr>
+        <w:t xml:space="preserve">Los bloques anteriores dejan afuera bureau_balance, el estado mes a mes de cada crédito reportado al Credit Bureau y, con 27,3 millones de filas, la tabla más grande del conjunto. Como tiene una fila por crédito y por mes, resumirla exige una agregación en dos niveles: primero el historial mensual de cada crédito y después los créditos de cada cliente. Construimos así 78 variables, entre ellas la proporción de meses en mora de cada crédito, el peor tramo de atraso alcanzado y los meses en mora del último año, que es información que los agregados simples de bureau no distinguen de una mora antigua.</w:t>
+      </w:r>
+    </w:p>
+    <w:p>
+      <w:pPr>
+        <w:spacing w:after="140" w:line="300"/>
+        <w:jc w:val="both"/>
+      </w:pPr>
+      <w:r>
+        <w:rPr>
+          <w:b/>
+          <w:bCs/>
+          <w:sz w:val="20"/>
+          <w:szCs w:val="20"/>
+        </w:rPr>
+        <w:t xml:space="preserve">Resultado de la comparación. </w:t>
+      </w:r>
+      <w:r>
+        <w:rPr>
+          <w:sz w:val="20"/>
+          <w:szCs w:val="20"/>
+        </w:rPr>
+        <w:t xml:space="preserve">Medido contra el bloque de bureau ya incorporado, con los mismos folds y el mismo LightGBM optimizado, el AUC out-of-fold pasa de 0,7846 a 0,7867, con mejora en los cinco folds (diferencia media de 0,0021 y desvío de 0,0009). Usar las dos versiones de bureau juntas no aporta nada adicional (0,7867), señal de que miden lo mismo. Aun así mantuvimos el modelo final sin este bloque: la mejora es del mismo orden que el sesgo optimista ya señalado sobre el 0,7847, que es el mejor de 30 pruebas evaluadas sobre estos mismos folds, y adoptarlo implicaba rehacer también la interpretabilidad de la sección 1.7. El experimento deja una conclusión de rendimiento decreciente: el historial mensual representa el 94% de las filas de las tablas del bureau y aporta 0,002 de AUC, porque la señal ya estaba casi toda capturada por el resumen a nivel crédito. El código y la comparación completa quedan en el repositorio (src/features_bureau.py y resultados_bureau/).</w:t>
       </w:r>
     </w:p>
     <w:p>

</xml_diff>